<commit_message>
labs: complete region-substitution rollout across CL1 deployment exemplars + decks
Deploy-layer refs now substitute to us-east-1 with the token; assessments unchanged
(nothing added/removed). CL1 AT2 + AT3 deployment exemplars: multi-AZ -> us-east-1a/1b,
AT3 Melbourne DR backup -> us-east-1 DR destination + [scenario: ...] tokens, all
screenshots/scope kept. topic06 deploy steps -> us-east-1 (design still mandates Sydney);
topic07 subnet AZ made relative; CL3 AT2 team-plan residency = design-assessed exception.
AT1 design artefacts (solution designs, business case, DR plan) keep real regions.
All 5 artefacts regenerated + text-verified.

Co-Authored-By: Claude Opus 4.8 <noreply@anthropic.com>
</commit_message>
<xml_diff>
--- a/S1-CL3-Cloud-Infrastructure-Improvement/assessments/AT2/AT2-exemplar-team-plan.docx
+++ b/S1-CL3-Cloud-Infrastructure-Improvement/assessments/AT2/AT2-exemplar-team-plan.docx
@@ -1639,7 +1639,7 @@
               <w:rPr>
                 <w:sz w:val="18"/>
               </w:rPr>
-              <w:t>Write the storage CloudFormation (S3 buckets with encryption/versioning/lifecycle, EBS) and the separate ap-south-1 residency stack.</w:t>
+              <w:t>Write the storage CloudFormation (S3 buckets with encryption/versioning/lifecycle, EBS), importing/naming what the other components reference.</w:t>
             </w:r>
           </w:p>
         </w:tc>
@@ -1658,7 +1658,7 @@
               <w:rPr>
                 <w:sz w:val="18"/>
               </w:rPr>
-              <w:t>Keep the residency buckets in the Mumbai region; reconcile lifecycle/retention with the design and the Indian Regulatory Requirements.</w:t>
+              <w:t>Reconcile lifecycle/retention with the design. The India log/books residency is addressed in the design only (per the Indian Regulatory Requirements) - it is not built as a separate deployed stack.</w:t>
             </w:r>
           </w:p>
         </w:tc>

</xml_diff>